<commit_message>
Update reviewer evaluations from supplied screenshots
</commit_message>
<xml_diff>
--- a/review/revision-1/Response-to-Reviewer-1.docx
+++ b/review/revision-1/Response-to-Reviewer-1.docx
@@ -267,7 +267,7 @@
                 <w:sz w:val="23"/>
                 <w:szCs w:val="23"/>
               </w:rPr>
-              <w:t xml:space="preserve">Not supplied</w:t>
+              <w:t xml:space="preserve">3/5 stars</w:t>
             </w:r>
           </w:p>
         </w:tc>
@@ -356,7 +356,7 @@
                 <w:sz w:val="23"/>
                 <w:szCs w:val="23"/>
               </w:rPr>
-              <w:t xml:space="preserve">Not supplied</w:t>
+              <w:t xml:space="preserve">4/5 stars</w:t>
             </w:r>
           </w:p>
         </w:tc>
@@ -445,7 +445,7 @@
                 <w:sz w:val="23"/>
                 <w:szCs w:val="23"/>
               </w:rPr>
-              <w:t xml:space="preserve">Not supplied</w:t>
+              <w:t xml:space="preserve">4/5 stars</w:t>
             </w:r>
           </w:p>
         </w:tc>
@@ -534,7 +534,7 @@
                 <w:sz w:val="23"/>
                 <w:szCs w:val="23"/>
               </w:rPr>
-              <w:t xml:space="preserve">Not supplied</w:t>
+              <w:t xml:space="preserve">5/5 stars</w:t>
             </w:r>
           </w:p>
         </w:tc>
@@ -562,7 +562,7 @@
                 <w:sz w:val="23"/>
                 <w:szCs w:val="23"/>
               </w:rPr>
-              <w:t xml:space="preserve">Relevant foundations and official specifications have been added.</w:t>
+              <w:t xml:space="preserve">Thank you for this positive assessment.</w:t>
             </w:r>
           </w:p>
         </w:tc>
@@ -623,7 +623,7 @@
                 <w:sz w:val="23"/>
                 <w:szCs w:val="23"/>
               </w:rPr>
-              <w:t xml:space="preserve">Not supplied</w:t>
+              <w:t xml:space="preserve">The English is fine and does not require any improvement.</w:t>
             </w:r>
           </w:p>
         </w:tc>
@@ -651,7 +651,7 @@
                 <w:sz w:val="23"/>
                 <w:szCs w:val="23"/>
               </w:rPr>
-              <w:t xml:space="preserve">The text has been edited for precision and repeated qualifications removed.</w:t>
+              <w:t xml:space="preserve">Thank you. Minor edits improve consistency and concision.</w:t>
             </w:r>
           </w:p>
         </w:tc>
@@ -963,7 +963,7 @@
                 <w:sz w:val="23"/>
                 <w:szCs w:val="23"/>
               </w:rPr>
-              <w:t xml:space="preserve">No separate English-language assessment was supplied.</w:t>
+              <w:t xml:space="preserve">The English is fine and does not require any improvement.</w:t>
             </w:r>
           </w:p>
         </w:tc>
@@ -997,7 +997,7 @@
                 <w:sz w:val="23"/>
                 <w:szCs w:val="23"/>
               </w:rPr>
-              <w:t xml:space="preserve">Response: The manuscript has been edited for direct, evidence-based phrasing, consistent terminology and concision. Figure wording and bibliography formatting have been corrected.</w:t>
+              <w:t xml:space="preserve">Response: Thank you for this assessment. We have made minor edits for consistency and concision while revising the manuscript.</w:t>
             </w:r>
           </w:p>
         </w:tc>
@@ -1067,7 +1067,7 @@
                 <w:sz w:val="23"/>
                 <w:szCs w:val="23"/>
               </w:rPr>
-              <w:t xml:space="preserve">The general-evaluation ratings were not included in the supplied review, so the example ratings in the template have not been attributed to the reviewer. The revised manuscript and supplement distinguish completed analytical checks from proposed implementation and field evaluation. The manuscript remains anonymous.</w:t>
+              <w:t xml:space="preserve">The revised manuscript and supplement distinguish completed analytical checks from proposed implementation and field evaluation. The manuscript remains anonymous.</w:t>
             </w:r>
           </w:p>
         </w:tc>

</xml_diff>

<commit_message>
Expand OAL evidence base and validate mapping robustness
</commit_message>
<xml_diff>
--- a/review/revision-1/Response-to-Reviewer-1.docx
+++ b/review/revision-1/Response-to-Reviewer-1.docx
@@ -790,7 +790,7 @@
                 <w:sz w:val="23"/>
                 <w:szCs w:val="23"/>
               </w:rPr>
-              <w:t xml:space="preserve">OAL is now applied to 23 full-text mechanism studies through 49 claim records. Section 2 describes the search, selection and coding procedure, Table 2 identifies the sampled mechanisms and their evidence profiles, and Section 5.2 interprets the resulting coverage. Figure 3 now pairs the original OAL framework schematic with a populated object–assurance–lifecycle heatmap. The supplementary CSV provides each study identifier, scoped claim, exact object/layer/stage association, evidence form and supporting passage. The sample is explicitly bounded; 14 additional original mechanism candidates remain outside completed full-text numerical coding, and empty cells are not presented as global research absences.</w:t>
+              <w:t xml:space="preserve">OAL is applied to 39 full-text mechanism studies through 89 scoped claim records. Section 2 distinguishes the 19 domain-focused studies, 20 transferable mechanisms and the 123-reference bibliography. Table 2 identifies the study groups; Figure 3 retains the original framework schematic beside the populated heatmap. Section 5.3 and Table 5 compare what AIS protection, observation corroboration, attestation, trust-aware routing and consensus actually support, and specify the evidence required at the next handover. Section 5.4 and Table 6 report domain stratification, exclusions and coding sensitivity, with all 39 leave-one-out results released. The supplements provide study versions, retrieval links, claim locators, reference roles and coding decisions. Four of the 14 previously uncoded original candidates were recovered; ten remain incompletely accessible. Zero cells describe this sample, while the physical UAV-node experiment is identified as a bounded positive precedent.</w:t>
             </w:r>
           </w:p>
         </w:tc>
@@ -824,7 +824,7 @@
                 <w:sz w:val="23"/>
                 <w:szCs w:val="23"/>
               </w:rPr>
-              <w:t xml:space="preserve">Section 6.4 replaces the previous freshness/lineage example with a coalition mission that loses its gateway connection, commits a shore-side key revocation, and reconciles records after reconnection. Event intervals before, overlapping and after the effective revocation time lead to historical eligibility, quarantine and rejection, respectively. The example distinguishes locally available delegation from global authority learned later. Table 6 compares these outcomes with a mean-score policy and a veto-aware scalar policy using the same features.</w:t>
+              <w:t xml:space="preserve">Section 6.4 replaces the previous freshness/lineage example with a coalition mission that loses its gateway connection, commits a shore-side key revocation, and reconciles records after reconnection. Event intervals before, overlapping and after the effective revocation time lead to historical eligibility, quarantine and rejection, respectively. The example distinguishes locally available delegation from global authority learned later. Table 8 compares these outcomes with a mean-score policy and a veto-aware scalar policy using the same features.</w:t>
             </w:r>
           </w:p>
         </w:tc>

</xml_diff>